<commit_message>
Add superscript citation markers and fix reference page numbers in thesis proposal
Co-authored-by: lawliet103110-art <247488912+lawliet103110-art@users.noreply.github.com>
</commit_message>
<xml_diff>
--- a/陶可_计算机z2204开题报告.docx
+++ b/陶可_计算机z2204开题报告.docx
@@ -958,7 +958,26 @@
           <w:szCs w:val="24"/>
           <w:lang w:val="en-US" w:eastAsia="zh-CN"/>
         </w:rPr>
-        <w:t>随着人工智能技术的快速发展，多模态感知模型凭借对多源异构数据的融合分析能力，在目标检测、智能感知、自动驾驶、人机交互等领域得到广泛应用。现阶段多模态感知模型的性能提升多依赖于网络结构复杂化和参数规模扩大，结合特征融合技术虽进一步提升了模型的检测精度和鲁棒性，但也带来了计算复杂度剧增、检测实时性下降、硬件部署要求高等问题，使其难以在边缘设备、嵌入式终端等计算能力受限的平台，以及实时检测、在线识别等对响应速度要求严苛的场景中落地。</w:t>
+        <w:t>随着人工智能技术的快速发展，多模态感知模型凭借对多源异构数据的融合分析能力，在目标检测、智能感知、自动驾驶、人机交互等领域得到广泛应用</w:t>
+      </w:r>
+      <w:r>
+        <w:rPr>
+          <w:rFonts w:hint="eastAsia" w:ascii="宋体" w:hAnsi="宋体" w:eastAsia="宋体" w:cs="宋体"/>
+          <w:sz w:val="24"/>
+          <w:szCs w:val="24"/>
+          <w:lang w:val="en-US" w:eastAsia="zh-CN"/>
+          <w:vertAlign w:val="superscript"/>
+        </w:rPr>
+        <w:t>[1-3]</w:t>
+      </w:r>
+      <w:r>
+        <w:rPr>
+          <w:rFonts w:hint="eastAsia" w:ascii="宋体" w:hAnsi="宋体" w:eastAsia="宋体" w:cs="宋体"/>
+          <w:sz w:val="24"/>
+          <w:szCs w:val="24"/>
+          <w:lang w:val="en-US" w:eastAsia="zh-CN"/>
+        </w:rPr>
+        <w:t>。现阶段多模态感知模型的性能提升多依赖于网络结构复杂化和参数规模扩大，结合特征融合技术虽进一步提升了模型的检测精度和鲁棒性，但也带来了计算复杂度剧增、检测实时性下降、硬件部署要求高等问题，使其难以在边缘设备、嵌入式终端等计算能力受限的平台，以及实时检测、在线识别等对响应速度要求严苛的场景中落地。</w:t>
       </w:r>
     </w:p>
     <w:p>
@@ -1012,7 +1031,26 @@
           <w:szCs w:val="24"/>
           <w:lang w:val="en-US" w:eastAsia="zh-CN"/>
         </w:rPr>
-        <w:t>实现简洁、工程适配性强、计算开销低，成为轻量级模型开发的优选方案。针对基于特征融合的多模态感知模型开展输出层面的知识蒸馏研究，能够有效解决该类模型 “精度高但部署难” 的痛点，同时在蒸馏过程中兼顾多模态特征融合的特性，减少跨模态知识迁移中的精度衰减，实现模型轻量化与检测性能的平衡。</w:t>
+        <w:t>实现简洁、工程适配性强、计算开销低，成为轻量级模型开发的优选方案</w:t>
+      </w:r>
+      <w:r>
+        <w:rPr>
+          <w:rFonts w:hint="eastAsia" w:ascii="宋体" w:hAnsi="宋体" w:eastAsia="宋体" w:cs="宋体"/>
+          <w:sz w:val="24"/>
+          <w:szCs w:val="24"/>
+          <w:lang w:val="en-US" w:eastAsia="zh-CN"/>
+          <w:vertAlign w:val="superscript"/>
+        </w:rPr>
+        <w:t>[4-6]</w:t>
+      </w:r>
+      <w:r>
+        <w:rPr>
+          <w:rFonts w:hint="eastAsia" w:ascii="宋体" w:hAnsi="宋体" w:eastAsia="宋体" w:cs="宋体"/>
+          <w:sz w:val="24"/>
+          <w:szCs w:val="24"/>
+          <w:lang w:val="en-US" w:eastAsia="zh-CN"/>
+        </w:rPr>
+        <w:t>。针对基于特征融合的多模态感知模型开展输出层面的知识蒸馏研究，能够有效解决该类模型 “精度高但部署难” 的痛点，同时在蒸馏过程中兼顾多模态特征融合的特性，减少跨模态知识迁移中的精度衰减，实现模型轻量化与检测性能的平衡。</w:t>
       </w:r>
     </w:p>
     <w:p>
@@ -1184,7 +1222,26 @@
           <w:szCs w:val="24"/>
           <w:lang w:val="en-US" w:eastAsia="zh-CN"/>
         </w:rPr>
-        <w:t>（1）多模态特征融合：国内外已形成较为成熟的技术体系，主要包括特征层融合、决策层融合与输出层融合。其中，特征层融合因能够充分挖掘模态间互补信息而成为主流方案。研究者提出了特征拼接、特征相加、注意力加权融合等方法，并与卷积神经网络、Transformer 等架构结合，在多模态感知任务中得到广泛验证，为后续知识蒸馏提供了坚实基础。</w:t>
+        <w:t xml:space="preserve">（1）多模态特征融合：国内外已形成较为成熟的技术体系，主要包括特征层融合、决策层融合与输出层融合。其中，特征层融合因能够充分挖掘模态间互补信息而成为主流方案。研究者提出了特征拼接、特征相加、注意力加权融合等方法，并与卷积神经网络、Transformer 等架构结合，在多模态感知任务中得到广泛验证，为后续知识蒸馏提供了坚实基础</w:t>
+      </w:r>
+      <w:r>
+        <w:rPr>
+          <w:rFonts w:hint="eastAsia" w:ascii="宋体" w:hAnsi="宋体" w:eastAsia="宋体" w:cs="宋体"/>
+          <w:sz w:val="24"/>
+          <w:szCs w:val="24"/>
+          <w:lang w:val="en-US" w:eastAsia="zh-CN"/>
+          <w:vertAlign w:val="superscript"/>
+        </w:rPr>
+        <w:t>[7-12]</w:t>
+      </w:r>
+      <w:r>
+        <w:rPr>
+          <w:rFonts w:hint="eastAsia" w:ascii="宋体" w:hAnsi="宋体" w:eastAsia="宋体" w:cs="宋体"/>
+          <w:sz w:val="24"/>
+          <w:szCs w:val="24"/>
+          <w:lang w:val="en-US" w:eastAsia="zh-CN"/>
+        </w:rPr>
+        <w:t>。</w:t>
       </w:r>
     </w:p>
     <w:p>
@@ -1227,7 +1284,45 @@
           <w:szCs w:val="24"/>
           <w:lang w:val="en-US" w:eastAsia="zh-CN"/>
         </w:rPr>
-        <w:t>（2）模型知识蒸馏：输出层蒸馏作为 Hinton 提出的经典框架，通过引导学生模型学习教师模型的软 logits，实现知识迁移。相比仅依赖硬标签，该方法能更好地保留样本间相似性信息，从而提升学生模型性能。近年来，研究者在蒸馏温度调节、混合损失函数设计、知识迁移策略优化等方面进行了改进，并在单模态模型轻量化中取得良好效果。然而，现有方法多针对单模态模型设计，对多模态模型的跨模态特性考虑不足，难以直接适配基于特征融合的多模态感知模型。</w:t>
+        <w:t xml:space="preserve">（2）模型知识蒸馏：输出层蒸馏作为 Hinton 提出的经典框架，通过引导学生模型学习教师模型的软 logits，实现知识迁移</w:t>
+      </w:r>
+      <w:r>
+        <w:rPr>
+          <w:rFonts w:hint="eastAsia" w:ascii="宋体" w:hAnsi="宋体" w:eastAsia="宋体" w:cs="宋体"/>
+          <w:sz w:val="24"/>
+          <w:szCs w:val="24"/>
+          <w:lang w:val="en-US" w:eastAsia="zh-CN"/>
+          <w:vertAlign w:val="superscript"/>
+        </w:rPr>
+        <w:t>[4,6]</w:t>
+      </w:r>
+      <w:r>
+        <w:rPr>
+          <w:rFonts w:hint="eastAsia" w:ascii="宋体" w:hAnsi="宋体" w:eastAsia="宋体" w:cs="宋体"/>
+          <w:sz w:val="24"/>
+          <w:szCs w:val="24"/>
+          <w:lang w:val="en-US" w:eastAsia="zh-CN"/>
+        </w:rPr>
+        <w:t>。相比仅依赖硬标签，该方法能更好地保留样本间相似性信息，从而提升学生模型性能。近年来，研究者在蒸馏温度调节、混合损失函数设计、知识迁移策略优化等方面进行了改进，并在单模态模型轻量化中取得良好效果</w:t>
+      </w:r>
+      <w:r>
+        <w:rPr>
+          <w:rFonts w:hint="eastAsia" w:ascii="宋体" w:hAnsi="宋体" w:eastAsia="宋体" w:cs="宋体"/>
+          <w:sz w:val="24"/>
+          <w:szCs w:val="24"/>
+          <w:lang w:val="en-US" w:eastAsia="zh-CN"/>
+          <w:vertAlign w:val="superscript"/>
+        </w:rPr>
+        <w:t>[5,13]</w:t>
+      </w:r>
+      <w:r>
+        <w:rPr>
+          <w:rFonts w:hint="eastAsia" w:ascii="宋体" w:hAnsi="宋体" w:eastAsia="宋体" w:cs="宋体"/>
+          <w:sz w:val="24"/>
+          <w:szCs w:val="24"/>
+          <w:lang w:val="en-US" w:eastAsia="zh-CN"/>
+        </w:rPr>
+        <w:t>。然而，现有方法多针对单模态模型设计，对多模态模型的跨模态特性考虑不足，难以直接适配基于特征融合的多模态感知模型。</w:t>
       </w:r>
     </w:p>
     <w:p>
@@ -1270,7 +1365,26 @@
           <w:szCs w:val="24"/>
           <w:lang w:val="en-US" w:eastAsia="zh-CN"/>
         </w:rPr>
-        <w:t>（3）多模态模型轻量化：知识蒸馏、剪枝、量化、神经架构搜索等技术的融合应用成为趋势。多数研究聚焦于特征层蒸馏，通过让学生模型学习教师模型的融合特征实现知识迁移，但该方法实现复杂、计算开销大，部署难度高。针对输出层蒸馏的适配性研究仍较少，尚未形成成熟的跨模态输出层蒸馏策略，容易导致知识迁移不足与精度衰减。</w:t>
+        <w:t>（3）多模态模型轻量化：知识蒸馏、剪枝、量化、神经架构搜索等技术的融合应用成为趋势。多数研究聚焦于特征层蒸馏，通过让学生模型学习教师模型的融合特征实现知识迁移，但该方法实现复杂、计算开销大，部署难度高</w:t>
+      </w:r>
+      <w:r>
+        <w:rPr>
+          <w:rFonts w:hint="eastAsia" w:ascii="宋体" w:hAnsi="宋体" w:eastAsia="宋体" w:cs="宋体"/>
+          <w:sz w:val="24"/>
+          <w:szCs w:val="24"/>
+          <w:lang w:val="en-US" w:eastAsia="zh-CN"/>
+          <w:vertAlign w:val="superscript"/>
+        </w:rPr>
+        <w:t>[14-16]</w:t>
+      </w:r>
+      <w:r>
+        <w:rPr>
+          <w:rFonts w:hint="eastAsia" w:ascii="宋体" w:hAnsi="宋体" w:eastAsia="宋体" w:cs="宋体"/>
+          <w:sz w:val="24"/>
+          <w:szCs w:val="24"/>
+          <w:lang w:val="en-US" w:eastAsia="zh-CN"/>
+        </w:rPr>
+        <w:t>。针对输出层蒸馏的适配性研究仍较少，尚未形成成熟的跨模态输出层蒸馏策略，容易导致知识迁移不足与精度衰减。</w:t>
       </w:r>
     </w:p>
     <w:p>
@@ -2944,7 +3058,7 @@
           <w:sz w:val="21"/>
           <w:szCs w:val="21"/>
         </w:rPr>
-        <w:t xml:space="preserve"> International Conference on Learning Representations (ICLR), San Diego, California, USA, 2015. </w:t>
+        <w:t xml:space="preserve"> International Conference on Learning Representations (ICLR), San Diego, California, USA, 2015: 1-13. </w:t>
       </w:r>
     </w:p>
     <w:p>
@@ -2974,7 +3088,7 @@
           <w:sz w:val="21"/>
           <w:szCs w:val="21"/>
         </w:rPr>
-        <w:t xml:space="preserve">[14] Ding R, Kuang Z, Zhou Z, et al. RayD3D: Distilling Depth Knowledge Along the Ray for Robust Multi-View 3D Object Detection[C]. 2024 IEEE/CVF Conference on Computer Vision and Pattern Recognition (CVPR), Seattle, Washington, USA, 2024. </w:t>
+        <w:t xml:space="preserve">[14] Ding R, Kuang Z, Zhou Z, et al. RayD3D: Distilling Depth Knowledge Along the Ray for Robust Multi-View 3D Object Detection[C]. 2024 IEEE/CVF Conference on Computer Vision and Pattern Recognition (CVPR), Seattle, Washington, USA, 2024: 15224-15233. </w:t>
       </w:r>
     </w:p>
     <w:p>
@@ -3034,7 +3148,7 @@
           <w:sz w:val="21"/>
           <w:szCs w:val="21"/>
         </w:rPr>
-        <w:t xml:space="preserve">[16] Munir F, Azam S, Kucner T, et al. Radar-Lidar Fusion for Object Detection by Designing Effective Convolution Networks[C]. 2024 IEEE International Conference on Robotics and Automation (ICRA), Yokohama, Japan, 2024. </w:t>
+        <w:t xml:space="preserve">[16] Munir F, Azam S, Kucner T, et al. Radar-Lidar Fusion for Object Detection by Designing Effective Convolution Networks[C]. 2024 IEEE International Conference on Robotics and Automation (ICRA), Yokohama, Japan, 2024: 6097-6103. </w:t>
       </w:r>
     </w:p>
     <w:p>

</xml_diff>

<commit_message>
Replace refs 13-16, convert interval citations to individual format, add more citations
Co-authored-by: lawliet103110-art <247488912+lawliet103110-art@users.noreply.github.com>
</commit_message>
<xml_diff>
--- a/陶可_计算机z2204开题报告.docx
+++ b/陶可_计算机z2204开题报告.docx
@@ -968,7 +968,7 @@
           <w:lang w:val="en-US" w:eastAsia="zh-CN"/>
           <w:vertAlign w:val="superscript"/>
         </w:rPr>
-        <w:t>[1-3]</w:t>
+        <w:t>[1,2,3]</w:t>
       </w:r>
       <w:r>
         <w:rPr>
@@ -1041,7 +1041,7 @@
           <w:lang w:val="en-US" w:eastAsia="zh-CN"/>
           <w:vertAlign w:val="superscript"/>
         </w:rPr>
-        <w:t>[4-6]</w:t>
+        <w:t>[4,5,6]</w:t>
       </w:r>
       <w:r>
         <w:rPr>
@@ -1179,7 +1179,26 @@
           <w:szCs w:val="24"/>
           <w:lang w:val="en-US" w:eastAsia="zh-CN"/>
         </w:rPr>
-        <w:t>多模态感知模型的轻量化是人工智能应用落地的重要研究方向。结合特征融合技术的输出层知识蒸馏研究，已逐渐成为国内外学者关注的热点。目前研究主要集中在三个方面：多模态特征融合、模型输出层知识蒸馏、多模态模型轻量化。</w:t>
+        <w:t>多模态感知模型的轻量化是人工智能应用落地的重要研究方向</w:t>
+      </w:r>
+      <w:r>
+        <w:rPr>
+          <w:rFonts w:hint="eastAsia" w:ascii="宋体" w:hAnsi="宋体" w:eastAsia="宋体" w:cs="宋体"/>
+          <w:sz w:val="24"/>
+          <w:szCs w:val="24"/>
+          <w:lang w:val="en-US" w:eastAsia="zh-CN"/>
+          <w:vertAlign w:val="superscript"/>
+        </w:rPr>
+        <w:t>[1,2,3]</w:t>
+      </w:r>
+      <w:r>
+        <w:rPr>
+          <w:rFonts w:hint="eastAsia" w:ascii="宋体" w:hAnsi="宋体" w:eastAsia="宋体" w:cs="宋体"/>
+          <w:sz w:val="24"/>
+          <w:szCs w:val="24"/>
+          <w:lang w:val="en-US" w:eastAsia="zh-CN"/>
+        </w:rPr>
+        <w:t>。结合特征融合技术的输出层知识蒸馏研究，已逐渐成为国内外学者关注的热点。目前研究主要集中在三个方面：多模态特征融合、模型输出层知识蒸馏、多模态模型轻量化。</w:t>
       </w:r>
     </w:p>
     <w:p>
@@ -1232,7 +1251,7 @@
           <w:lang w:val="en-US" w:eastAsia="zh-CN"/>
           <w:vertAlign w:val="superscript"/>
         </w:rPr>
-        <w:t>[7-12]</w:t>
+        <w:t>[7,8,9,10,11,12]</w:t>
       </w:r>
       <w:r>
         <w:rPr>
@@ -1313,7 +1332,7 @@
           <w:lang w:val="en-US" w:eastAsia="zh-CN"/>
           <w:vertAlign w:val="superscript"/>
         </w:rPr>
-        <w:t>[5,13]</w:t>
+        <w:t>[5,13,14]</w:t>
       </w:r>
       <w:r>
         <w:rPr>
@@ -1365,7 +1384,7 @@
           <w:szCs w:val="24"/>
           <w:lang w:val="en-US" w:eastAsia="zh-CN"/>
         </w:rPr>
-        <w:t>（3）多模态模型轻量化：知识蒸馏、剪枝、量化、神经架构搜索等技术的融合应用成为趋势。多数研究聚焦于特征层蒸馏，通过让学生模型学习教师模型的融合特征实现知识迁移，但该方法实现复杂、计算开销大，部署难度高</w:t>
+        <w:t>（3）多模态模型轻量化：知识蒸馏、剪枝、量化、神经架构搜索等技术的融合应用成为趋势</w:t>
       </w:r>
       <w:r>
         <w:rPr>
@@ -1375,7 +1394,26 @@
           <w:lang w:val="en-US" w:eastAsia="zh-CN"/>
           <w:vertAlign w:val="superscript"/>
         </w:rPr>
-        <w:t>[14-16]</w:t>
+        <w:t>[4,5,6]</w:t>
+      </w:r>
+      <w:r>
+        <w:rPr>
+          <w:rFonts w:hint="eastAsia" w:ascii="宋体" w:hAnsi="宋体" w:eastAsia="宋体" w:cs="宋体"/>
+          <w:sz w:val="24"/>
+          <w:szCs w:val="24"/>
+          <w:lang w:val="en-US" w:eastAsia="zh-CN"/>
+        </w:rPr>
+        <w:t>。多数研究聚焦于特征层蒸馏，通过让学生模型学习教师模型的融合特征实现知识迁移，但该方法实现复杂、计算开销大，部署难度高</w:t>
+      </w:r>
+      <w:r>
+        <w:rPr>
+          <w:rFonts w:hint="eastAsia" w:ascii="宋体" w:hAnsi="宋体" w:eastAsia="宋体" w:cs="宋体"/>
+          <w:sz w:val="24"/>
+          <w:szCs w:val="24"/>
+          <w:lang w:val="en-US" w:eastAsia="zh-CN"/>
+          <w:vertAlign w:val="superscript"/>
+        </w:rPr>
+        <w:t>[14,15,16]</w:t>
       </w:r>
       <w:r>
         <w:rPr>
@@ -1427,7 +1465,26 @@
           <w:szCs w:val="24"/>
           <w:lang w:val="en-US" w:eastAsia="zh-CN"/>
         </w:rPr>
-        <w:t>综上，尽管已有一定进展，但基于特征融合的多模态感知模型输出层蒸馏仍存在研究空白：①现有算法未充分考虑跨模态特征融合特性；②缺乏针对多模态输出的专属蒸馏损失函数与超参数配置；③输出层蒸馏与特征融合的联合优化研究不足。</w:t>
+        <w:t>综上，尽管已有一定进展，但基于特征融合的多模态感知模型输出层蒸馏仍存在研究空白：①现有算法未充分考虑跨模态特征融合特性；②缺乏针对多模态输出的专属蒸馏损失函数与超参数配置；③输出层蒸馏与特征融合的联合优化研究不足</w:t>
+      </w:r>
+      <w:r>
+        <w:rPr>
+          <w:rFonts w:hint="eastAsia" w:ascii="宋体" w:hAnsi="宋体" w:eastAsia="宋体" w:cs="宋体"/>
+          <w:sz w:val="24"/>
+          <w:szCs w:val="24"/>
+          <w:lang w:val="en-US" w:eastAsia="zh-CN"/>
+          <w:vertAlign w:val="superscript"/>
+        </w:rPr>
+        <w:t>[13,14,15,16]</w:t>
+      </w:r>
+      <w:r>
+        <w:rPr>
+          <w:rFonts w:hint="eastAsia" w:ascii="宋体" w:hAnsi="宋体" w:eastAsia="宋体" w:cs="宋体"/>
+          <w:sz w:val="24"/>
+          <w:szCs w:val="24"/>
+          <w:lang w:val="en-US" w:eastAsia="zh-CN"/>
+        </w:rPr>
+        <w:t>。</w:t>
       </w:r>
     </w:p>
     <w:p>
@@ -3037,28 +3094,7 @@
           <w:sz w:val="21"/>
           <w:szCs w:val="21"/>
         </w:rPr>
-        <w:t>[13] Romero A, Ballas N, Kahou S E, et al. FitNets: Hints for Thin Deep Nets[C].</w:t>
-      </w:r>
-      <w:r>
-        <w:rPr>
-          <w:rFonts w:hint="eastAsia" w:ascii="Times New Roman" w:cs="Times New Roman"/>
-          <w:color w:val="000000"/>
-          <w:kern w:val="2"/>
-          <w:sz w:val="21"/>
-          <w:szCs w:val="21"/>
-          <w:lang w:val="en-US" w:eastAsia="zh-CN"/>
-        </w:rPr>
-        <w:t>2015</w:t>
-      </w:r>
-      <w:r>
-        <w:rPr>
-          <w:rFonts w:ascii="Times New Roman" w:cs="Times New Roman"/>
-          <w:color w:val="000000"/>
-          <w:kern w:val="2"/>
-          <w:sz w:val="21"/>
-          <w:szCs w:val="21"/>
-        </w:rPr>
-        <w:t xml:space="preserve"> International Conference on Learning Representations (ICLR), San Diego, California, USA, 2015: 1-13. </w:t>
+        <w:t xml:space="preserve">[13] Zhao B, Cui Q, Song R, et al. Decoupled Knowledge Distillation[C]. 2022 IEEE/CVF Conference on Computer Vision and Pattern Recognition (CVPR), New Orleans, Louisiana, USA, 2022: 11953-11962. </w:t>
       </w:r>
     </w:p>
     <w:p>
@@ -3088,7 +3124,7 @@
           <w:sz w:val="21"/>
           <w:szCs w:val="21"/>
         </w:rPr>
-        <w:t xml:space="preserve">[14] Ding R, Kuang Z, Zhou Z, et al. RayD3D: Distilling Depth Knowledge Along the Ray for Robust Multi-View 3D Object Detection[C]. 2024 IEEE/CVF Conference on Computer Vision and Pattern Recognition (CVPR), Seattle, Washington, USA, 2024: 15224-15233. </w:t>
+        <w:t xml:space="preserve">[14] Park W, Kim D, Lu Y, et al. Relational Knowledge Distillation[C]. 2019 IEEE/CVF Conference on Computer Vision and Pattern Recognition (CVPR), Long Beach, California, USA, 2019: 3967-3976. </w:t>
       </w:r>
     </w:p>
     <w:p>
@@ -3118,7 +3154,7 @@
           <w:sz w:val="21"/>
           <w:szCs w:val="21"/>
         </w:rPr>
-        <w:t xml:space="preserve">[15] Yang B, Tao T, Wu W, et al. MultiDistiller: Efficient Multimodal 3D Detection via Knowledge Distillation for Drones and Autonomous Vehicles[J]. Drones, 2025, 9(5): 322. </w:t>
+        <w:t xml:space="preserve">[15] Heo B, Kim J, Yun S, et al. A Comprehensive Overhaul of Feature Distillation[C]. 2019 IEEE/CVF International Conference on Computer Vision (ICCV), Seoul, South Korea, 2019: 1272-1281. </w:t>
       </w:r>
     </w:p>
     <w:p>
@@ -3148,7 +3184,7 @@
           <w:sz w:val="21"/>
           <w:szCs w:val="21"/>
         </w:rPr>
-        <w:t xml:space="preserve">[16] Munir F, Azam S, Kucner T, et al. Radar-Lidar Fusion for Object Detection by Designing Effective Convolution Networks[C]. 2024 IEEE International Conference on Robotics and Automation (ICRA), Yokohama, Japan, 2024: 6097-6103. </w:t>
+        <w:t xml:space="preserve">[16] Zhang Y, Xiang T, Hospedales T M, et al. Deep Mutual Learning[C]. 2018 IEEE/CVF Conference on Computer Vision and Pattern Recognition (CVPR), Salt Lake City, Utah, USA, 2018: 4320-4328. </w:t>
       </w:r>
     </w:p>
     <w:p>

</xml_diff>

<commit_message>
Add missing state/province to refs [3] and [5] for consistent location format in [C] references
Co-authored-by: lawliet103110-art <247488912+lawliet103110-art@users.noreply.github.com>
</commit_message>
<xml_diff>
--- a/陶可_计算机z2204开题报告.docx
+++ b/陶可_计算机z2204开题报告.docx
@@ -2619,7 +2619,7 @@
           <w:sz w:val="21"/>
           <w:szCs w:val="21"/>
         </w:rPr>
-        <w:t xml:space="preserve"> IEEE/CVF Conference on Computer Vision and Pattern Recognition Workshops (CVPRW), Vancouver, Canada, 2023: 172-181. </w:t>
+        <w:t xml:space="preserve"> IEEE/CVF Conference on Computer Vision and Pattern Recognition Workshops (CVPRW), Vancouver, British Columbia, Canada, 2023: 172-181. </w:t>
       </w:r>
     </w:p>
     <w:p>
@@ -2749,7 +2749,7 @@
           <w:sz w:val="21"/>
           <w:szCs w:val="21"/>
         </w:rPr>
-        <w:t xml:space="preserve"> Proceedings of the AAAI Conference on Artificial Intelligence, New York, USA, 2020, 34(4): 5191–5198. </w:t>
+        <w:t xml:space="preserve"> Proceedings of the AAAI Conference on Artificial Intelligence, New York, New York, USA, 2020, 34(4): 5191–5198. </w:t>
       </w:r>
     </w:p>
     <w:p>

</xml_diff>

<commit_message>
Add citation [13,14,15,16] to uncited concluding sentence in knowledge distillation section; remove stray screenshot
Co-authored-by: lawliet103110-art <247488912+lawliet103110-art@users.noreply.github.com>
</commit_message>
<xml_diff>
--- a/陶可_计算机z2204开题报告.docx
+++ b/陶可_计算机z2204开题报告.docx
@@ -1341,7 +1341,26 @@
           <w:szCs w:val="24"/>
           <w:lang w:val="en-US" w:eastAsia="zh-CN"/>
         </w:rPr>
-        <w:t>。然而，现有方法多针对单模态模型设计，对多模态模型的跨模态特性考虑不足，难以直接适配基于特征融合的多模态感知模型。</w:t>
+        <w:t>。然而，现有方法多针对单模态模型设计，对多模态模型的跨模态特性考虑不足，难以直接适配基于特征融合的多模态感知模型</w:t>
+      </w:r>
+      <w:r>
+        <w:rPr>
+          <w:rFonts w:hint="eastAsia" w:ascii="宋体" w:hAnsi="宋体" w:eastAsia="宋体" w:cs="宋体"/>
+          <w:sz w:val="24"/>
+          <w:szCs w:val="24"/>
+          <w:lang w:val="en-US" w:eastAsia="zh-CN"/>
+          <w:vertAlign w:val="superscript"/>
+        </w:rPr>
+        <w:t>[13,14,15,16]</w:t>
+      </w:r>
+      <w:r>
+        <w:rPr>
+          <w:rFonts w:hint="eastAsia" w:ascii="宋体" w:hAnsi="宋体" w:eastAsia="宋体" w:cs="宋体"/>
+          <w:sz w:val="24"/>
+          <w:szCs w:val="24"/>
+          <w:lang w:val="en-US" w:eastAsia="zh-CN"/>
+        </w:rPr>
+        <w:t>。</w:t>
       </w:r>
     </w:p>
     <w:p>

</xml_diff>